<commit_message>
Italian series: Matteo as male protagonist, ep1 retold from his POV; sync overview
Co-Authored-By: Claude Opus 5.5 <noreply@anthropic.com>
Claude-Session: https://claude.ai/code/session_014Pwa4fJotSRvNewqVrvk7U
</commit_message>
<xml_diff>
--- a/business_it/part1/ep01_Il_pranzo_della_domenica.docx
+++ b/business_it/part1/ep01_Il_pranzo_della_domenica.docx
@@ -139,7 +139,7 @@
                 <w:b w:val="0"/>
                 <w:sz w:val="19"/>
               </w:rPr>
-              <w:t>키아라 (Chiara) — 2화는 필리포, 3화는 마테오 시점</w:t>
+              <w:t>마테오 (Matteo, 주인공) — 2화는 필리포, 3화는 다시 마테오 시점</w:t>
             </w:r>
           </w:p>
         </w:tc>
@@ -180,7 +180,7 @@
                 <w:b w:val="0"/>
                 <w:sz w:val="19"/>
               </w:rPr>
-              <w:t>Graziella (어머니·회장) · Filippo (맏아들·총괄 사장) · Chiara (둘째·디자이너) · Matteo (막내·수출 담당) · Renzo (가죽 장인) · Giulia (필리포의 딸, 16)</w:t>
+              <w:t>Matteo (주인공·막내·수출 담당) · Graziella (어머니·회장) · Filippo (맏아들·총괄 사장) · Chiara (둘째·디자이너) · Renzo (가죽 장인) · Giulia (필리포의 딸, 16)</w:t>
             </w:r>
           </w:p>
         </w:tc>
@@ -303,7 +303,7 @@
                 <w:b w:val="0"/>
                 <w:sz w:val="19"/>
               </w:rPr>
-              <w:t>대화 120턴 (Filippo 31 · Chiara 25 · Graziella 22 · Matteo 21 · Renzo 15 · Giulia 6) · A2 15% / B1 40% / B2 35% / C1 10% 목표</w:t>
+              <w:t>대화 120턴 (Matteo 32 · Filippo 30 · Graziella 21 · Chiara 16 · Renzo 15 · Giulia 6) · A2 15% / B1 40% / B2 35% / C1 10% 목표</w:t>
             </w:r>
           </w:p>
         </w:tc>
@@ -340,7 +340,7 @@
           <w:color w:val="666666"/>
           <w:sz w:val="18"/>
         </w:rPr>
-        <w:t>이 시리즈에는 한 명의 주인공이 없습니다. 화마다 시점 인물(POV)이 바뀝니다.</w:t>
+        <w:t>이 시리즈의 주인공은 막내 마테오입니다. 이야기의 중심축은 마테오가 이끌고, 일부 화는 필리포·키아라·그라치엘라의 시점으로 진행됩니다.</w:t>
       </w:r>
     </w:p>
     <w:p>
@@ -412,7 +412,7 @@
           <w:rFonts w:ascii="Calibri" w:hAnsi="Calibri" w:eastAsia="Malgun Gothic"/>
           <w:sz w:val="20"/>
         </w:rPr>
-        <w:t xml:space="preserve">  · Matteo (마테오, 31) — 막내. 런던에서 MBA 후 서울의 백화점 수입 부서에서 3년 근무하고 막 귀국. 수출과 온라인 판매를 밀어붙인다.</w:t>
+        <w:t xml:space="preserve">  · Matteo (마테오, 31) — ★주인공. 막내. 런던에서 MBA 후 서울의 백화점 수입 부서에서 3년 근무하고 3주 전 귀국. 수출과 온라인 판매를 밀어붙인다.</w:t>
       </w:r>
     </w:p>
     <w:p>
@@ -500,7 +500,7 @@
           <w:color w:val="666666"/>
           <w:sz w:val="19"/>
         </w:rPr>
-        <w:t>Una lunga tavola di legno, la ribollita fumante nella zuppiera. Graziella Corsini serve tutti, come ogni domenica da quarant'anni. Accanto a lei Renzo, il maestro pellettiere, invitato fisso. Filippo, il primogenito, guarda il telefono sotto la tovaglia.</w:t>
+        <w:t>Matteo è tornato da Seul da tre settimane, e la tavola di casa gli sembra identica a quella di quando aveva dieci anni: la lunga tavola di legno, la ribollita fumante nella zuppiera, Graziella che serve tutti come ogni domenica da quarant'anni, Renzo, il maestro pellettiere, invitato fisso. Solo una cosa è diversa: Filippo, il primogenito, guarda il telefono sotto la tovaglia.</w:t>
       </w:r>
     </w:p>
     <w:p>
@@ -622,7 +622,7 @@
           <w:color w:val="7A1F3D"/>
           <w:sz w:val="21"/>
         </w:rPr>
-        <w:t>Chiara:</w:t>
+        <w:t>Matteo:</w:t>
       </w:r>
       <w:r>
         <w:rPr>
@@ -671,7 +671,7 @@
         <w:rPr>
           <w:rFonts w:ascii="Calibri" w:hAnsi="Calibri" w:eastAsia="Malgun Gothic"/>
           <w:b/>
-          <w:color w:val="0F6E6E"/>
+          <w:color w:val="7A1F3D"/>
           <w:sz w:val="21"/>
         </w:rPr>
         <w:t>Matteo:</w:t>
@@ -723,7 +723,7 @@
         <w:rPr>
           <w:rFonts w:ascii="Calibri" w:hAnsi="Calibri" w:eastAsia="Malgun Gothic"/>
           <w:b/>
-          <w:color w:val="553C7A"/>
+          <w:color w:val="0F6E6E"/>
           <w:sz w:val="21"/>
         </w:rPr>
         <w:t>Renzo:</w:t>
@@ -775,7 +775,7 @@
         <w:rPr>
           <w:rFonts w:ascii="Calibri" w:hAnsi="Calibri" w:eastAsia="Malgun Gothic"/>
           <w:b/>
-          <w:color w:val="553C7A"/>
+          <w:color w:val="0F6E6E"/>
           <w:sz w:val="21"/>
         </w:rPr>
         <w:t>Renzo:</w:t>
@@ -801,7 +801,7 @@
         <w:rPr>
           <w:rFonts w:ascii="Calibri" w:hAnsi="Calibri" w:eastAsia="Malgun Gothic"/>
           <w:b/>
-          <w:color w:val="0F6E6E"/>
+          <w:color w:val="7A1F3D"/>
           <w:sz w:val="21"/>
         </w:rPr>
         <w:t>Matteo:</w:t>
@@ -827,7 +827,7 @@
         <w:rPr>
           <w:rFonts w:ascii="Calibri" w:hAnsi="Calibri" w:eastAsia="Malgun Gothic"/>
           <w:b/>
-          <w:color w:val="553C7A"/>
+          <w:color w:val="0F6E6E"/>
           <w:sz w:val="21"/>
         </w:rPr>
         <w:t>Renzo:</w:t>
@@ -856,7 +856,7 @@
           <w:color w:val="7A1F3D"/>
           <w:sz w:val="21"/>
         </w:rPr>
-        <w:t>Chiara:</w:t>
+        <w:t>Matteo:</w:t>
       </w:r>
       <w:r>
         <w:rPr>
@@ -920,10 +920,10 @@
         <w:rPr>
           <w:rFonts w:ascii="Calibri" w:hAnsi="Calibri" w:eastAsia="Malgun Gothic"/>
           <w:b/>
-          <w:color w:val="2E6B3A"/>
-          <w:sz w:val="21"/>
-        </w:rPr>
-        <w:t>Graziella:</w:t>
+          <w:color w:val="7A1F3D"/>
+          <w:sz w:val="21"/>
+        </w:rPr>
+        <w:t>Matteo:</w:t>
       </w:r>
       <w:r>
         <w:rPr>
@@ -931,7 +931,7 @@
           <w:sz w:val="22"/>
         </w:rPr>
         <w:tab/>
-        <w:t>Che cosa hanno detto?</w:t>
+        <w:t>Che cosa ti hanno scritto?</w:t>
       </w:r>
     </w:p>
     <w:p>
@@ -972,7 +972,7 @@
         <w:rPr>
           <w:rFonts w:ascii="Calibri" w:hAnsi="Calibri" w:eastAsia="Malgun Gothic"/>
           <w:b/>
-          <w:color w:val="7A1F3D"/>
+          <w:color w:val="553C7A"/>
           <w:sz w:val="21"/>
         </w:rPr>
         <w:t>Chiara:</w:t>
@@ -1050,7 +1050,7 @@
         <w:rPr>
           <w:rFonts w:ascii="Calibri" w:hAnsi="Calibri" w:eastAsia="Malgun Gothic"/>
           <w:b/>
-          <w:color w:val="0F6E6E"/>
+          <w:color w:val="7A1F3D"/>
           <w:sz w:val="21"/>
         </w:rPr>
         <w:t>Matteo:</w:t>
@@ -1154,7 +1154,7 @@
         <w:rPr>
           <w:rFonts w:ascii="Calibri" w:hAnsi="Calibri" w:eastAsia="Malgun Gothic"/>
           <w:b/>
-          <w:color w:val="7A1F3D"/>
+          <w:color w:val="553C7A"/>
           <w:sz w:val="21"/>
         </w:rPr>
         <w:t>Chiara:</w:t>
@@ -1206,7 +1206,7 @@
         <w:rPr>
           <w:rFonts w:ascii="Calibri" w:hAnsi="Calibri" w:eastAsia="Malgun Gothic"/>
           <w:b/>
-          <w:color w:val="7A1F3D"/>
+          <w:color w:val="553C7A"/>
           <w:sz w:val="21"/>
         </w:rPr>
         <w:t>Chiara:</w:t>
@@ -1310,7 +1310,7 @@
         <w:rPr>
           <w:rFonts w:ascii="Calibri" w:hAnsi="Calibri" w:eastAsia="Malgun Gothic"/>
           <w:b/>
-          <w:color w:val="0F6E6E"/>
+          <w:color w:val="7A1F3D"/>
           <w:sz w:val="21"/>
         </w:rPr>
         <w:t>Matteo:</w:t>
@@ -1362,7 +1362,7 @@
         <w:rPr>
           <w:rFonts w:ascii="Calibri" w:hAnsi="Calibri" w:eastAsia="Malgun Gothic"/>
           <w:b/>
-          <w:color w:val="0F6E6E"/>
+          <w:color w:val="7A1F3D"/>
           <w:sz w:val="21"/>
         </w:rPr>
         <w:t>Matteo:</w:t>
@@ -1414,7 +1414,7 @@
         <w:rPr>
           <w:rFonts w:ascii="Calibri" w:hAnsi="Calibri" w:eastAsia="Malgun Gothic"/>
           <w:b/>
-          <w:color w:val="7A1F3D"/>
+          <w:color w:val="553C7A"/>
           <w:sz w:val="21"/>
         </w:rPr>
         <w:t>Chiara:</w:t>
@@ -1440,7 +1440,7 @@
         <w:rPr>
           <w:rFonts w:ascii="Calibri" w:hAnsi="Calibri" w:eastAsia="Malgun Gothic"/>
           <w:b/>
-          <w:color w:val="0F6E6E"/>
+          <w:color w:val="7A1F3D"/>
           <w:sz w:val="21"/>
         </w:rPr>
         <w:t>Matteo:</w:t>
@@ -1492,7 +1492,7 @@
         <w:rPr>
           <w:rFonts w:ascii="Calibri" w:hAnsi="Calibri" w:eastAsia="Malgun Gothic"/>
           <w:b/>
-          <w:color w:val="0F6E6E"/>
+          <w:color w:val="7A1F3D"/>
           <w:sz w:val="21"/>
         </w:rPr>
         <w:t>Matteo:</w:t>
@@ -1544,7 +1544,7 @@
         <w:rPr>
           <w:rFonts w:ascii="Calibri" w:hAnsi="Calibri" w:eastAsia="Malgun Gothic"/>
           <w:b/>
-          <w:color w:val="0F6E6E"/>
+          <w:color w:val="7A1F3D"/>
           <w:sz w:val="21"/>
         </w:rPr>
         <w:t>Matteo:</w:t>
@@ -1596,7 +1596,7 @@
         <w:rPr>
           <w:rFonts w:ascii="Calibri" w:hAnsi="Calibri" w:eastAsia="Malgun Gothic"/>
           <w:b/>
-          <w:color w:val="7A1F3D"/>
+          <w:color w:val="553C7A"/>
           <w:sz w:val="21"/>
         </w:rPr>
         <w:t>Chiara:</w:t>
@@ -1622,7 +1622,7 @@
         <w:rPr>
           <w:rFonts w:ascii="Calibri" w:hAnsi="Calibri" w:eastAsia="Malgun Gothic"/>
           <w:b/>
-          <w:color w:val="0F6E6E"/>
+          <w:color w:val="7A1F3D"/>
           <w:sz w:val="21"/>
         </w:rPr>
         <w:t>Matteo:</w:t>
@@ -1674,7 +1674,7 @@
         <w:rPr>
           <w:rFonts w:ascii="Calibri" w:hAnsi="Calibri" w:eastAsia="Malgun Gothic"/>
           <w:b/>
-          <w:color w:val="7A1F3D"/>
+          <w:color w:val="553C7A"/>
           <w:sz w:val="21"/>
         </w:rPr>
         <w:t>Chiara:</w:t>
@@ -1726,7 +1726,7 @@
         <w:rPr>
           <w:rFonts w:ascii="Calibri" w:hAnsi="Calibri" w:eastAsia="Malgun Gothic"/>
           <w:b/>
-          <w:color w:val="7A1F3D"/>
+          <w:color w:val="553C7A"/>
           <w:sz w:val="21"/>
         </w:rPr>
         <w:t>Chiara:</w:t>
@@ -1804,7 +1804,7 @@
         <w:rPr>
           <w:rFonts w:ascii="Calibri" w:hAnsi="Calibri" w:eastAsia="Malgun Gothic"/>
           <w:b/>
-          <w:color w:val="7A1F3D"/>
+          <w:color w:val="553C7A"/>
           <w:sz w:val="21"/>
         </w:rPr>
         <w:t>Chiara:</w:t>
@@ -1830,7 +1830,7 @@
         <w:rPr>
           <w:rFonts w:ascii="Calibri" w:hAnsi="Calibri" w:eastAsia="Malgun Gothic"/>
           <w:b/>
-          <w:color w:val="553C7A"/>
+          <w:color w:val="0F6E6E"/>
           <w:sz w:val="21"/>
         </w:rPr>
         <w:t>Renzo:</w:t>
@@ -1882,7 +1882,7 @@
         <w:rPr>
           <w:rFonts w:ascii="Calibri" w:hAnsi="Calibri" w:eastAsia="Malgun Gothic"/>
           <w:b/>
-          <w:color w:val="553C7A"/>
+          <w:color w:val="0F6E6E"/>
           <w:sz w:val="21"/>
         </w:rPr>
         <w:t>Renzo:</w:t>
@@ -1908,7 +1908,7 @@
         <w:rPr>
           <w:rFonts w:ascii="Calibri" w:hAnsi="Calibri" w:eastAsia="Malgun Gothic"/>
           <w:b/>
-          <w:color w:val="0F6E6E"/>
+          <w:color w:val="7A1F3D"/>
           <w:sz w:val="21"/>
         </w:rPr>
         <w:t>Matteo:</w:t>
@@ -1934,7 +1934,7 @@
         <w:rPr>
           <w:rFonts w:ascii="Calibri" w:hAnsi="Calibri" w:eastAsia="Malgun Gothic"/>
           <w:b/>
-          <w:color w:val="553C7A"/>
+          <w:color w:val="0F6E6E"/>
           <w:sz w:val="21"/>
         </w:rPr>
         <w:t>Renzo:</w:t>
@@ -1989,7 +1989,7 @@
           <w:color w:val="7A1F3D"/>
           <w:sz w:val="21"/>
         </w:rPr>
-        <w:t>Chiara:</w:t>
+        <w:t>Matteo:</w:t>
       </w:r>
       <w:r>
         <w:rPr>
@@ -2119,7 +2119,7 @@
           <w:color w:val="7A1F3D"/>
           <w:sz w:val="21"/>
         </w:rPr>
-        <w:t>Chiara:</w:t>
+        <w:t>Matteo:</w:t>
       </w:r>
       <w:r>
         <w:rPr>
@@ -2287,7 +2287,7 @@
         <w:rPr>
           <w:rFonts w:ascii="Calibri" w:hAnsi="Calibri" w:eastAsia="Malgun Gothic"/>
           <w:b/>
-          <w:color w:val="553C7A"/>
+          <w:color w:val="0F6E6E"/>
           <w:sz w:val="21"/>
         </w:rPr>
         <w:t>Renzo:</w:t>
@@ -2313,7 +2313,7 @@
         <w:rPr>
           <w:rFonts w:ascii="Calibri" w:hAnsi="Calibri" w:eastAsia="Malgun Gothic"/>
           <w:b/>
-          <w:color w:val="0F6E6E"/>
+          <w:color w:val="7A1F3D"/>
           <w:sz w:val="21"/>
         </w:rPr>
         <w:t>Matteo:</w:t>
@@ -2365,7 +2365,7 @@
         <w:rPr>
           <w:rFonts w:ascii="Calibri" w:hAnsi="Calibri" w:eastAsia="Malgun Gothic"/>
           <w:b/>
-          <w:color w:val="7A1F3D"/>
+          <w:color w:val="553C7A"/>
           <w:sz w:val="21"/>
         </w:rPr>
         <w:t>Chiara:</w:t>
@@ -2417,7 +2417,7 @@
         <w:rPr>
           <w:rFonts w:ascii="Calibri" w:hAnsi="Calibri" w:eastAsia="Malgun Gothic"/>
           <w:b/>
-          <w:color w:val="7A1F3D"/>
+          <w:color w:val="553C7A"/>
           <w:sz w:val="21"/>
         </w:rPr>
         <w:t>Chiara:</w:t>
@@ -2443,7 +2443,7 @@
         <w:rPr>
           <w:rFonts w:ascii="Calibri" w:hAnsi="Calibri" w:eastAsia="Malgun Gothic"/>
           <w:b/>
-          <w:color w:val="0F6E6E"/>
+          <w:color w:val="7A1F3D"/>
           <w:sz w:val="21"/>
         </w:rPr>
         <w:t>Matteo:</w:t>
@@ -2495,7 +2495,7 @@
         <w:rPr>
           <w:rFonts w:ascii="Calibri" w:hAnsi="Calibri" w:eastAsia="Malgun Gothic"/>
           <w:b/>
-          <w:color w:val="0F6E6E"/>
+          <w:color w:val="7A1F3D"/>
           <w:sz w:val="21"/>
         </w:rPr>
         <w:t>Matteo:</w:t>
@@ -2547,7 +2547,7 @@
         <w:rPr>
           <w:rFonts w:ascii="Calibri" w:hAnsi="Calibri" w:eastAsia="Malgun Gothic"/>
           <w:b/>
-          <w:color w:val="0F6E6E"/>
+          <w:color w:val="7A1F3D"/>
           <w:sz w:val="21"/>
         </w:rPr>
         <w:t>Matteo:</w:t>
@@ -2640,7 +2640,7 @@
         <w:rPr>
           <w:rFonts w:ascii="Calibri" w:hAnsi="Calibri" w:eastAsia="Malgun Gothic"/>
           <w:b/>
-          <w:color w:val="7A1F3D"/>
+          <w:color w:val="553C7A"/>
           <w:sz w:val="21"/>
         </w:rPr>
         <w:t>Chiara:</w:t>
@@ -2692,7 +2692,7 @@
         <w:rPr>
           <w:rFonts w:ascii="Calibri" w:hAnsi="Calibri" w:eastAsia="Malgun Gothic"/>
           <w:b/>
-          <w:color w:val="0F6E6E"/>
+          <w:color w:val="7A1F3D"/>
           <w:sz w:val="21"/>
         </w:rPr>
         <w:t>Matteo:</w:t>
@@ -2744,10 +2744,10 @@
         <w:rPr>
           <w:rFonts w:ascii="Calibri" w:hAnsi="Calibri" w:eastAsia="Malgun Gothic"/>
           <w:b/>
-          <w:color w:val="1F5A8C"/>
-          <w:sz w:val="21"/>
-        </w:rPr>
-        <w:t>Filippo:</w:t>
+          <w:color w:val="7A1F3D"/>
+          <w:sz w:val="21"/>
+        </w:rPr>
+        <w:t>Matteo:</w:t>
       </w:r>
       <w:r>
         <w:rPr>
@@ -2848,7 +2848,7 @@
         <w:rPr>
           <w:rFonts w:ascii="Calibri" w:hAnsi="Calibri" w:eastAsia="Malgun Gothic"/>
           <w:b/>
-          <w:color w:val="7A1F3D"/>
+          <w:color w:val="553C7A"/>
           <w:sz w:val="21"/>
         </w:rPr>
         <w:t>Chiara:</w:t>
@@ -2900,7 +2900,7 @@
         <w:rPr>
           <w:rFonts w:ascii="Calibri" w:hAnsi="Calibri" w:eastAsia="Malgun Gothic"/>
           <w:b/>
-          <w:color w:val="0F6E6E"/>
+          <w:color w:val="7A1F3D"/>
           <w:sz w:val="21"/>
         </w:rPr>
         <w:t>Matteo:</w:t>
@@ -3004,7 +3004,7 @@
         <w:rPr>
           <w:rFonts w:ascii="Calibri" w:hAnsi="Calibri" w:eastAsia="Malgun Gothic"/>
           <w:b/>
-          <w:color w:val="553C7A"/>
+          <w:color w:val="0F6E6E"/>
           <w:sz w:val="21"/>
         </w:rPr>
         <w:t>Renzo:</w:t>
@@ -3030,7 +3030,7 @@
         <w:rPr>
           <w:rFonts w:ascii="Calibri" w:hAnsi="Calibri" w:eastAsia="Malgun Gothic"/>
           <w:b/>
-          <w:color w:val="0F6E6E"/>
+          <w:color w:val="7A1F3D"/>
           <w:sz w:val="21"/>
         </w:rPr>
         <w:t>Matteo:</w:t>
@@ -3082,7 +3082,7 @@
         <w:rPr>
           <w:rFonts w:ascii="Calibri" w:hAnsi="Calibri" w:eastAsia="Malgun Gothic"/>
           <w:b/>
-          <w:color w:val="7A1F3D"/>
+          <w:color w:val="553C7A"/>
           <w:sz w:val="21"/>
         </w:rPr>
         <w:t>Chiara:</w:t>
@@ -3201,7 +3201,7 @@
           <w:color w:val="666666"/>
           <w:sz w:val="19"/>
         </w:rPr>
-        <w:t>Le luci al neon sopra i banchi di taglio, l'odore di cuoio e di colla. Chiara è sola davanti a dodici prototipi allineati. La porta si apre: è Renzo, con il suo mazzo di chiavi.</w:t>
+        <w:t>Le luci al neon sopra i banchi di taglio, l'odore di cuoio e di colla. Matteo è solo davanti ai dodici prototipi di Chiara, allineati su un banco. Li fotografa uno per uno con il telefono. La porta si apre: è Renzo, con il suo mazzo di chiavi.</w:t>
       </w:r>
     </w:p>
     <w:p>
@@ -3216,7 +3216,7 @@
         <w:rPr>
           <w:rFonts w:ascii="Calibri" w:hAnsi="Calibri" w:eastAsia="Malgun Gothic"/>
           <w:b/>
-          <w:color w:val="553C7A"/>
+          <w:color w:val="0F6E6E"/>
           <w:sz w:val="21"/>
         </w:rPr>
         <w:t>Renzo:</w:t>
@@ -3227,7 +3227,7 @@
           <w:sz w:val="22"/>
         </w:rPr>
         <w:tab/>
-        <w:t>Lo sapevo che ti trovavo qui.</w:t>
+        <w:t>Quarantacinque anni di laboratorio, e la domenica sera vengo ancora a controllare che le luci siano spente. Stavolta però sono accese.</w:t>
       </w:r>
     </w:p>
     <w:p>
@@ -3245,7 +3245,7 @@
           <w:color w:val="7A1F3D"/>
           <w:sz w:val="21"/>
         </w:rPr>
-        <w:t>Chiara:</w:t>
+        <w:t>Matteo:</w:t>
       </w:r>
       <w:r>
         <w:rPr>
@@ -3253,7 +3253,7 @@
           <w:sz w:val="22"/>
         </w:rPr>
         <w:tab/>
-        <w:t>Renzo... Non riuscivo a stare a casa.</w:t>
+        <w:t>Renzo! Scusi... scusa, non ti ho sentito entrare. Volevo fotografare la collezione di Chiara per Seul.</w:t>
       </w:r>
     </w:p>
     <w:p>
@@ -3268,7 +3268,7 @@
         <w:rPr>
           <w:rFonts w:ascii="Calibri" w:hAnsi="Calibri" w:eastAsia="Malgun Gothic"/>
           <w:b/>
-          <w:color w:val="553C7A"/>
+          <w:color w:val="0F6E6E"/>
           <w:sz w:val="21"/>
         </w:rPr>
         <w:t>Renzo:</w:t>
@@ -3279,7 +3279,7 @@
           <w:sz w:val="22"/>
         </w:rPr>
         <w:tab/>
-        <w:t>Nemmeno io. Quarantacinque anni di laboratorio, e la domenica sera vengo ancora a controllare che le luci siano spente.</w:t>
+        <w:t>Senza chiederglielo?</w:t>
       </w:r>
     </w:p>
     <w:p>
@@ -3297,7 +3297,7 @@
           <w:color w:val="7A1F3D"/>
           <w:sz w:val="21"/>
         </w:rPr>
-        <w:t>Chiara:</w:t>
+        <w:t>Matteo:</w:t>
       </w:r>
       <w:r>
         <w:rPr>
@@ -3305,7 +3305,7 @@
           <w:sz w:val="22"/>
         </w:rPr>
         <w:tab/>
-        <w:t>Guardi... guarda. È la collezione. Dodici modelli. Che ne pensi, sinceramente?</w:t>
+        <w:t>Gliel'ho chiesto a tavola. Non ha detto di no.</w:t>
       </w:r>
     </w:p>
     <w:p>
@@ -3320,7 +3320,7 @@
         <w:rPr>
           <w:rFonts w:ascii="Calibri" w:hAnsi="Calibri" w:eastAsia="Malgun Gothic"/>
           <w:b/>
-          <w:color w:val="553C7A"/>
+          <w:color w:val="0F6E6E"/>
           <w:sz w:val="21"/>
         </w:rPr>
         <w:t>Renzo:</w:t>
@@ -3331,7 +3331,7 @@
           <w:sz w:val="22"/>
         </w:rPr>
         <w:tab/>
-        <w:t>(prende una borsa, la gira, passa il pollice sulle cuciture) La costa è tinta bene. Il punto è regolare. Questa l'avrebbe potuta fare tuo nonno.</w:t>
+        <w:t>Non ha detto nemmeno di sì. (prende una borsa, la gira, passa il pollice sulle cuciture) Però una cosa è certa: la costa è tinta bene, il punto è regolare. Questa l'avrebbe potuta fare tuo nonno.</w:t>
       </w:r>
     </w:p>
     <w:p>
@@ -3349,7 +3349,7 @@
           <w:color w:val="7A1F3D"/>
           <w:sz w:val="21"/>
         </w:rPr>
-        <w:t>Chiara:</w:t>
+        <w:t>Matteo:</w:t>
       </w:r>
       <w:r>
         <w:rPr>
@@ -3357,7 +3357,7 @@
           <w:sz w:val="22"/>
         </w:rPr>
         <w:tab/>
-        <w:t>È il complimento più bello che potessi farmi.</w:t>
+        <w:t>Per Chiara è il complimento più bello che tu potessi fare. Allora si può vendere a Seul?</w:t>
       </w:r>
     </w:p>
     <w:p>
@@ -3372,7 +3372,7 @@
         <w:rPr>
           <w:rFonts w:ascii="Calibri" w:hAnsi="Calibri" w:eastAsia="Malgun Gothic"/>
           <w:b/>
-          <w:color w:val="553C7A"/>
+          <w:color w:val="0F6E6E"/>
           <w:sz w:val="21"/>
         </w:rPr>
         <w:t>Renzo:</w:t>
@@ -3383,7 +3383,7 @@
           <w:sz w:val="22"/>
         </w:rPr>
         <w:tab/>
-        <w:t>Non è un complimento, è un giudizio tecnico. Però manca una cosa.</w:t>
+        <w:t>Si può vendere ovunque. Però manca una cosa.</w:t>
       </w:r>
     </w:p>
     <w:p>
@@ -3401,7 +3401,7 @@
           <w:color w:val="7A1F3D"/>
           <w:sz w:val="21"/>
         </w:rPr>
-        <w:t>Chiara:</w:t>
+        <w:t>Matteo:</w:t>
       </w:r>
       <w:r>
         <w:rPr>
@@ -3409,7 +3409,7 @@
           <w:sz w:val="22"/>
         </w:rPr>
         <w:tab/>
-        <w:t>Cosa?</w:t>
+        <w:t>Cosa? Il prezzo? Il marchio?</w:t>
       </w:r>
     </w:p>
     <w:p>
@@ -3424,7 +3424,7 @@
         <w:rPr>
           <w:rFonts w:ascii="Calibri" w:hAnsi="Calibri" w:eastAsia="Malgun Gothic"/>
           <w:b/>
-          <w:color w:val="553C7A"/>
+          <w:color w:val="0F6E6E"/>
           <w:sz w:val="21"/>
         </w:rPr>
         <w:t>Renzo:</w:t>
@@ -3435,7 +3435,7 @@
           <w:sz w:val="22"/>
         </w:rPr>
         <w:tab/>
-        <w:t>Il coraggio dei tuoi fratelli. Filippo ha quello di tenere in piedi la baracca. Matteo quello di partire.</w:t>
+        <w:t>Il coraggio dei tuoi fratelli. Filippo ha quello di tenere in piedi la baracca. Chiara ha le mani.</w:t>
       </w:r>
     </w:p>
     <w:p>
@@ -3453,7 +3453,7 @@
           <w:color w:val="7A1F3D"/>
           <w:sz w:val="21"/>
         </w:rPr>
-        <w:t>Chiara:</w:t>
+        <w:t>Matteo:</w:t>
       </w:r>
       <w:r>
         <w:rPr>
@@ -3476,7 +3476,7 @@
         <w:rPr>
           <w:rFonts w:ascii="Calibri" w:hAnsi="Calibri" w:eastAsia="Malgun Gothic"/>
           <w:b/>
-          <w:color w:val="553C7A"/>
+          <w:color w:val="0F6E6E"/>
           <w:sz w:val="21"/>
         </w:rPr>
         <w:t>Renzo:</w:t>
@@ -3487,22 +3487,7 @@
           <w:sz w:val="22"/>
         </w:rPr>
         <w:tab/>
-        <w:t>Tu hai le mani. Ma le mani, da sole, non vendono.</w:t>
-      </w:r>
-    </w:p>
-    <w:p>
-      <w:pPr>
-        <w:spacing w:after="120" w:before="80" w:line="288" w:lineRule="auto"/>
-      </w:pPr>
-      <w:r>
-        <w:rPr>
-          <w:rFonts w:ascii="Calibri" w:hAnsi="Calibri" w:eastAsia="Malgun Gothic"/>
-          <w:b w:val="0"/>
-          <w:i/>
-          <w:color w:val="666666"/>
-          <w:sz w:val="19"/>
-        </w:rPr>
-        <w:t>La porta si apre di nuovo. Matteo entra con il portatile sotto il braccio.</w:t>
+        <w:t>Tu hai la valigia sempre pronta, Matteo. Ma la valigia, da sola, non vende. E le mani, da sole, nemmeno.</w:t>
       </w:r>
     </w:p>
     <w:p>
@@ -3517,7 +3502,7 @@
         <w:rPr>
           <w:rFonts w:ascii="Calibri" w:hAnsi="Calibri" w:eastAsia="Malgun Gothic"/>
           <w:b/>
-          <w:color w:val="0F6E6E"/>
+          <w:color w:val="7A1F3D"/>
           <w:sz w:val="21"/>
         </w:rPr>
         <w:t>Matteo:</w:t>
@@ -3528,7 +3513,22 @@
           <w:sz w:val="22"/>
         </w:rPr>
         <w:tab/>
-        <w:t>Ah, siete qui anche voi. Allora non sono l'unico matto della famiglia.</w:t>
+        <w:t>Quindi dobbiamo essere in tre. Come dice la mamma.</w:t>
+      </w:r>
+    </w:p>
+    <w:p>
+      <w:pPr>
+        <w:spacing w:after="120" w:before="80" w:line="288" w:lineRule="auto"/>
+      </w:pPr>
+      <w:r>
+        <w:rPr>
+          <w:rFonts w:ascii="Calibri" w:hAnsi="Calibri" w:eastAsia="Malgun Gothic"/>
+          <w:b w:val="0"/>
+          <w:i/>
+          <w:color w:val="666666"/>
+          <w:sz w:val="19"/>
+        </w:rPr>
+        <w:t>La porta si apre di nuovo. Chiara entra, il cappotto ancora addosso, e vede le sue borse sotto la luce del telefono di Matteo.</w:t>
       </w:r>
     </w:p>
     <w:p>
@@ -3543,7 +3543,7 @@
         <w:rPr>
           <w:rFonts w:ascii="Calibri" w:hAnsi="Calibri" w:eastAsia="Malgun Gothic"/>
           <w:b/>
-          <w:color w:val="7A1F3D"/>
+          <w:color w:val="553C7A"/>
           <w:sz w:val="21"/>
         </w:rPr>
         <w:t>Chiara:</w:t>
@@ -3554,7 +3554,7 @@
           <w:sz w:val="22"/>
         </w:rPr>
         <w:tab/>
-        <w:t>Che ci fai qui?</w:t>
+        <w:t>Che ci fai qui con le mie borse?</w:t>
       </w:r>
     </w:p>
     <w:p>
@@ -3569,7 +3569,7 @@
         <w:rPr>
           <w:rFonts w:ascii="Calibri" w:hAnsi="Calibri" w:eastAsia="Malgun Gothic"/>
           <w:b/>
-          <w:color w:val="0F6E6E"/>
+          <w:color w:val="7A1F3D"/>
           <w:sz w:val="21"/>
         </w:rPr>
         <w:t>Matteo:</w:t>
@@ -3595,7 +3595,7 @@
         <w:rPr>
           <w:rFonts w:ascii="Calibri" w:hAnsi="Calibri" w:eastAsia="Malgun Gothic"/>
           <w:b/>
-          <w:color w:val="7A1F3D"/>
+          <w:color w:val="553C7A"/>
           <w:sz w:val="21"/>
         </w:rPr>
         <w:t>Chiara:</w:t>
@@ -3621,7 +3621,7 @@
         <w:rPr>
           <w:rFonts w:ascii="Calibri" w:hAnsi="Calibri" w:eastAsia="Malgun Gothic"/>
           <w:b/>
-          <w:color w:val="0F6E6E"/>
+          <w:color w:val="7A1F3D"/>
           <w:sz w:val="21"/>
         </w:rPr>
         <w:t>Matteo:</w:t>
@@ -3647,7 +3647,7 @@
         <w:rPr>
           <w:rFonts w:ascii="Calibri" w:hAnsi="Calibri" w:eastAsia="Malgun Gothic"/>
           <w:b/>
-          <w:color w:val="7A1F3D"/>
+          <w:color w:val="553C7A"/>
           <w:sz w:val="21"/>
         </w:rPr>
         <w:t>Chiara:</w:t>
@@ -3673,7 +3673,7 @@
         <w:rPr>
           <w:rFonts w:ascii="Calibri" w:hAnsi="Calibri" w:eastAsia="Malgun Gothic"/>
           <w:b/>
-          <w:color w:val="0F6E6E"/>
+          <w:color w:val="7A1F3D"/>
           <w:sz w:val="21"/>
         </w:rPr>
         <w:t>Matteo:</w:t>
@@ -3684,7 +3684,7 @@
           <w:sz w:val="22"/>
         </w:rPr>
         <w:tab/>
-        <w:t>Esiste. È lì, sul tuo tavolo. Manca solo il prezzo.</w:t>
+        <w:t>Esiste. È qui, sul tuo tavolo. Manca solo il prezzo.</w:t>
       </w:r>
     </w:p>
     <w:p>
@@ -3699,7 +3699,7 @@
         <w:rPr>
           <w:rFonts w:ascii="Calibri" w:hAnsi="Calibri" w:eastAsia="Malgun Gothic"/>
           <w:b/>
-          <w:color w:val="553C7A"/>
+          <w:color w:val="0F6E6E"/>
           <w:sz w:val="21"/>
         </w:rPr>
         <w:t>Renzo:</w:t>
@@ -3725,7 +3725,7 @@
           <w:color w:val="666666"/>
           <w:sz w:val="19"/>
         </w:rPr>
-        <w:t>Nessuno ride. Matteo tiene il dito sopra il tasto « Invia ». Chiara guarda le dodici borse, poi il telefono, e compone il numero del fratello maggiore.</w:t>
+        <w:t>Nessuno ride. Matteo tiene il dito sopra il tasto « Invia ». Guarda le dodici borse, poi la sorella. Chiara annuisce appena. Matteo toglie il dito dal tasto, prende il telefono e compone il numero del fratello maggiore.</w:t>
       </w:r>
     </w:p>
     <w:p>
@@ -4023,7 +4023,7 @@
                 <w:b w:val="0"/>
                 <w:sz w:val="19"/>
               </w:rPr>
-              <w:t>키아라가 필리포를 재촉</w:t>
+              <w:t>마테오가 필리포를 재촉</w:t>
             </w:r>
           </w:p>
         </w:tc>
@@ -4722,7 +4722,7 @@
           <w:b/>
           <w:sz w:val="22"/>
         </w:rPr>
-        <w:t>키아라의 말실수: « Guardi... guarda. »</w:t>
+        <w:t>마테오의 말실수: « Scusi... scusa »</w:t>
       </w:r>
     </w:p>
     <w:p>
@@ -4735,7 +4735,7 @@
           <w:rFonts w:ascii="Calibri" w:hAnsi="Calibri" w:eastAsia="Malgun Gothic"/>
           <w:sz w:val="20"/>
         </w:rPr>
-        <w:t>공방에서 렌초에게 무심코 Lei 명령형(Guardi)을 쓰다가 tu(guarda)로 고친다. 일하는 공간에 들어서자 '장인 앞의 직원'으로 돌아간 순간을 보여 준다.</w:t>
+        <w:t>밤의 공방에서 렌초에게 무심코 Lei 명령형(Scusi)을 쓰다가 tu(scusa)로 고친다. 작업장에 들어서자 '장인 앞의 수습생'으로 돌아간 순간을 보여 준다.</w:t>
       </w:r>
     </w:p>
     <w:p>
@@ -7757,7 +7757,7 @@
           <w:rFonts w:ascii="Calibri" w:hAnsi="Calibri" w:eastAsia="Malgun Gothic"/>
           <w:sz w:val="20"/>
         </w:rPr>
-        <w:t>tu 명령형에는 대명사가 뒤에 붙고(lascialo, ripetilo), Lei 명령형에는 앞에 온다(Mi lasci parlare). 키아라의 « Guardi... guarda »는 Lei 명령형(guardi)과 tu 명령형(guarda)의 형태 차이를 그대로 보여 준다.</w:t>
+        <w:t>tu 명령형에는 대명사가 뒤에 붙고(lascialo, ripetilo), Lei 명령형에는 앞에 온다(Mi lasci parlare). 마테오의 « Scusi... scusa »는 Lei 명령형(scusi)과 tu 명령형(scusa)의 형태 차이를 그대로 보여 준다.</w:t>
       </w:r>
     </w:p>
     <w:p>
@@ -7852,7 +7852,7 @@
           <w:b/>
           <w:sz w:val="22"/>
         </w:rPr>
-        <w:t>최상급·비교 뒤의 접속법: il complimento più bello che potessi farmi / è più facile che nevichi</w:t>
+        <w:t>최상급·비교 뒤의 접속법: il complimento più bello che tu potessi fare / è più facile che nevichi</w:t>
       </w:r>
     </w:p>
     <w:p>
@@ -7865,7 +7865,7 @@
           <w:rFonts w:ascii="Calibri" w:hAnsi="Calibri" w:eastAsia="Malgun Gothic"/>
           <w:sz w:val="20"/>
         </w:rPr>
-        <w:t>상대적 최상급(il più … che) 뒤에는 접속법을 쓴다: che potessi(접속법 반과거). 비인칭 표현 è facile/difficile che 뒤에도 접속법: che nevichi. 회화체에서도 격식 있는 표현에서는 지켜진다.</w:t>
+        <w:t>상대적 최상급(il più … che) 뒤에는 접속법을 쓴다: che tu potessi(접속법 반과거). 비인칭 표현 è facile/difficile che 뒤에도 접속법: che nevichi. 회화체에서도 격식 있는 표현에서는 지켜진다.</w:t>
       </w:r>
     </w:p>
     <w:p>
@@ -8285,7 +8285,7 @@
           <w:color w:val="666666"/>
           <w:sz w:val="19"/>
         </w:rPr>
-        <w:t>긴 나무 식탁, 수프 그릇에서 김이 오르는 리볼리타. 그라치엘라 코르시니가 40년 동안 매주 일요일 그래 왔듯 모두에게 음식을 덜어 준다. 그 옆에는 늘 초대받는 가죽 장인 렌초. 맏아들 필리포는 식탁보 아래로 휴대폰을 보고 있다.</w:t>
+        <w:t>서울에서 돌아온 지 3주. 마테오에게 집 식탁은 열 살 때와 똑같아 보인다. 긴 나무 식탁, 수프 그릇에서 김이 오르는 리볼리타, 40년 동안 매주 일요일 그래 왔듯 모두에게 음식을 덜어 주는 그라치엘라, 늘 초대받는 가죽 장인 렌초. 달라진 것은 하나뿐이다. 맏아들 필리포가 식탁보 아래로 휴대폰을 보고 있다.</w:t>
       </w:r>
     </w:p>
     <w:p>
@@ -8407,7 +8407,7 @@
           <w:color w:val="7A1F3D"/>
           <w:sz w:val="21"/>
         </w:rPr>
-        <w:t>Chiara:</w:t>
+        <w:t>Matteo:</w:t>
       </w:r>
       <w:r>
         <w:rPr>
@@ -8456,7 +8456,7 @@
         <w:rPr>
           <w:rFonts w:ascii="Calibri" w:hAnsi="Calibri" w:eastAsia="Malgun Gothic"/>
           <w:b/>
-          <w:color w:val="0F6E6E"/>
+          <w:color w:val="7A1F3D"/>
           <w:sz w:val="21"/>
         </w:rPr>
         <w:t>Matteo:</w:t>
@@ -8508,7 +8508,7 @@
         <w:rPr>
           <w:rFonts w:ascii="Calibri" w:hAnsi="Calibri" w:eastAsia="Malgun Gothic"/>
           <w:b/>
-          <w:color w:val="553C7A"/>
+          <w:color w:val="0F6E6E"/>
           <w:sz w:val="21"/>
         </w:rPr>
         <w:t>Renzo:</w:t>
@@ -8560,7 +8560,7 @@
         <w:rPr>
           <w:rFonts w:ascii="Calibri" w:hAnsi="Calibri" w:eastAsia="Malgun Gothic"/>
           <w:b/>
-          <w:color w:val="553C7A"/>
+          <w:color w:val="0F6E6E"/>
           <w:sz w:val="21"/>
         </w:rPr>
         <w:t>Renzo:</w:t>
@@ -8586,7 +8586,7 @@
         <w:rPr>
           <w:rFonts w:ascii="Calibri" w:hAnsi="Calibri" w:eastAsia="Malgun Gothic"/>
           <w:b/>
-          <w:color w:val="0F6E6E"/>
+          <w:color w:val="7A1F3D"/>
           <w:sz w:val="21"/>
         </w:rPr>
         <w:t>Matteo:</w:t>
@@ -8612,7 +8612,7 @@
         <w:rPr>
           <w:rFonts w:ascii="Calibri" w:hAnsi="Calibri" w:eastAsia="Malgun Gothic"/>
           <w:b/>
-          <w:color w:val="553C7A"/>
+          <w:color w:val="0F6E6E"/>
           <w:sz w:val="21"/>
         </w:rPr>
         <w:t>Renzo:</w:t>
@@ -8641,7 +8641,7 @@
           <w:color w:val="7A1F3D"/>
           <w:sz w:val="21"/>
         </w:rPr>
-        <w:t>Chiara:</w:t>
+        <w:t>Matteo:</w:t>
       </w:r>
       <w:r>
         <w:rPr>
@@ -8649,7 +8649,7 @@
           <w:sz w:val="21"/>
         </w:rPr>
         <w:tab/>
-        <w:t>필리포, 그러지 말고. 다 모였잖아. 메종 일이지, 그렇지?</w:t>
+        <w:t>형, 그러지 말고. 다 모였잖아. 메종 일이지, 그렇지?</w:t>
       </w:r>
     </w:p>
     <w:p>
@@ -8705,10 +8705,10 @@
         <w:rPr>
           <w:rFonts w:ascii="Calibri" w:hAnsi="Calibri" w:eastAsia="Malgun Gothic"/>
           <w:b/>
-          <w:color w:val="2E6B3A"/>
-          <w:sz w:val="21"/>
-        </w:rPr>
-        <w:t>Graziella:</w:t>
+          <w:color w:val="7A1F3D"/>
+          <w:sz w:val="21"/>
+        </w:rPr>
+        <w:t>Matteo:</w:t>
       </w:r>
       <w:r>
         <w:rPr>
@@ -8716,7 +8716,7 @@
           <w:sz w:val="21"/>
         </w:rPr>
         <w:tab/>
-        <w:t>뭐라고 했니?</w:t>
+        <w:t>뭐라고 썼는데?</w:t>
       </w:r>
     </w:p>
     <w:p>
@@ -8757,7 +8757,7 @@
         <w:rPr>
           <w:rFonts w:ascii="Calibri" w:hAnsi="Calibri" w:eastAsia="Malgun Gothic"/>
           <w:b/>
-          <w:color w:val="7A1F3D"/>
+          <w:color w:val="553C7A"/>
           <w:sz w:val="21"/>
         </w:rPr>
         <w:t>Chiara:</w:t>
@@ -8835,7 +8835,7 @@
         <w:rPr>
           <w:rFonts w:ascii="Calibri" w:hAnsi="Calibri" w:eastAsia="Malgun Gothic"/>
           <w:b/>
-          <w:color w:val="0F6E6E"/>
+          <w:color w:val="7A1F3D"/>
           <w:sz w:val="21"/>
         </w:rPr>
         <w:t>Matteo:</w:t>
@@ -8939,7 +8939,7 @@
         <w:rPr>
           <w:rFonts w:ascii="Calibri" w:hAnsi="Calibri" w:eastAsia="Malgun Gothic"/>
           <w:b/>
-          <w:color w:val="7A1F3D"/>
+          <w:color w:val="553C7A"/>
           <w:sz w:val="21"/>
         </w:rPr>
         <w:t>Chiara:</w:t>
@@ -8991,7 +8991,7 @@
         <w:rPr>
           <w:rFonts w:ascii="Calibri" w:hAnsi="Calibri" w:eastAsia="Malgun Gothic"/>
           <w:b/>
-          <w:color w:val="7A1F3D"/>
+          <w:color w:val="553C7A"/>
           <w:sz w:val="21"/>
         </w:rPr>
         <w:t>Chiara:</w:t>
@@ -9095,7 +9095,7 @@
         <w:rPr>
           <w:rFonts w:ascii="Calibri" w:hAnsi="Calibri" w:eastAsia="Malgun Gothic"/>
           <w:b/>
-          <w:color w:val="0F6E6E"/>
+          <w:color w:val="7A1F3D"/>
           <w:sz w:val="21"/>
         </w:rPr>
         <w:t>Matteo:</w:t>
@@ -9147,7 +9147,7 @@
         <w:rPr>
           <w:rFonts w:ascii="Calibri" w:hAnsi="Calibri" w:eastAsia="Malgun Gothic"/>
           <w:b/>
-          <w:color w:val="0F6E6E"/>
+          <w:color w:val="7A1F3D"/>
           <w:sz w:val="21"/>
         </w:rPr>
         <w:t>Matteo:</w:t>
@@ -9199,7 +9199,7 @@
         <w:rPr>
           <w:rFonts w:ascii="Calibri" w:hAnsi="Calibri" w:eastAsia="Malgun Gothic"/>
           <w:b/>
-          <w:color w:val="7A1F3D"/>
+          <w:color w:val="553C7A"/>
           <w:sz w:val="21"/>
         </w:rPr>
         <w:t>Chiara:</w:t>
@@ -9225,7 +9225,7 @@
         <w:rPr>
           <w:rFonts w:ascii="Calibri" w:hAnsi="Calibri" w:eastAsia="Malgun Gothic"/>
           <w:b/>
-          <w:color w:val="0F6E6E"/>
+          <w:color w:val="7A1F3D"/>
           <w:sz w:val="21"/>
         </w:rPr>
         <w:t>Matteo:</w:t>
@@ -9277,7 +9277,7 @@
         <w:rPr>
           <w:rFonts w:ascii="Calibri" w:hAnsi="Calibri" w:eastAsia="Malgun Gothic"/>
           <w:b/>
-          <w:color w:val="0F6E6E"/>
+          <w:color w:val="7A1F3D"/>
           <w:sz w:val="21"/>
         </w:rPr>
         <w:t>Matteo:</w:t>
@@ -9329,7 +9329,7 @@
         <w:rPr>
           <w:rFonts w:ascii="Calibri" w:hAnsi="Calibri" w:eastAsia="Malgun Gothic"/>
           <w:b/>
-          <w:color w:val="0F6E6E"/>
+          <w:color w:val="7A1F3D"/>
           <w:sz w:val="21"/>
         </w:rPr>
         <w:t>Matteo:</w:t>
@@ -9381,7 +9381,7 @@
         <w:rPr>
           <w:rFonts w:ascii="Calibri" w:hAnsi="Calibri" w:eastAsia="Malgun Gothic"/>
           <w:b/>
-          <w:color w:val="7A1F3D"/>
+          <w:color w:val="553C7A"/>
           <w:sz w:val="21"/>
         </w:rPr>
         <w:t>Chiara:</w:t>
@@ -9407,7 +9407,7 @@
         <w:rPr>
           <w:rFonts w:ascii="Calibri" w:hAnsi="Calibri" w:eastAsia="Malgun Gothic"/>
           <w:b/>
-          <w:color w:val="0F6E6E"/>
+          <w:color w:val="7A1F3D"/>
           <w:sz w:val="21"/>
         </w:rPr>
         <w:t>Matteo:</w:t>
@@ -9459,7 +9459,7 @@
         <w:rPr>
           <w:rFonts w:ascii="Calibri" w:hAnsi="Calibri" w:eastAsia="Malgun Gothic"/>
           <w:b/>
-          <w:color w:val="7A1F3D"/>
+          <w:color w:val="553C7A"/>
           <w:sz w:val="21"/>
         </w:rPr>
         <w:t>Chiara:</w:t>
@@ -9511,7 +9511,7 @@
         <w:rPr>
           <w:rFonts w:ascii="Calibri" w:hAnsi="Calibri" w:eastAsia="Malgun Gothic"/>
           <w:b/>
-          <w:color w:val="7A1F3D"/>
+          <w:color w:val="553C7A"/>
           <w:sz w:val="21"/>
         </w:rPr>
         <w:t>Chiara:</w:t>
@@ -9589,7 +9589,7 @@
         <w:rPr>
           <w:rFonts w:ascii="Calibri" w:hAnsi="Calibri" w:eastAsia="Malgun Gothic"/>
           <w:b/>
-          <w:color w:val="7A1F3D"/>
+          <w:color w:val="553C7A"/>
           <w:sz w:val="21"/>
         </w:rPr>
         <w:t>Chiara:</w:t>
@@ -9615,7 +9615,7 @@
         <w:rPr>
           <w:rFonts w:ascii="Calibri" w:hAnsi="Calibri" w:eastAsia="Malgun Gothic"/>
           <w:b/>
-          <w:color w:val="553C7A"/>
+          <w:color w:val="0F6E6E"/>
           <w:sz w:val="21"/>
         </w:rPr>
         <w:t>Renzo:</w:t>
@@ -9667,7 +9667,7 @@
         <w:rPr>
           <w:rFonts w:ascii="Calibri" w:hAnsi="Calibri" w:eastAsia="Malgun Gothic"/>
           <w:b/>
-          <w:color w:val="553C7A"/>
+          <w:color w:val="0F6E6E"/>
           <w:sz w:val="21"/>
         </w:rPr>
         <w:t>Renzo:</w:t>
@@ -9693,7 +9693,7 @@
         <w:rPr>
           <w:rFonts w:ascii="Calibri" w:hAnsi="Calibri" w:eastAsia="Malgun Gothic"/>
           <w:b/>
-          <w:color w:val="0F6E6E"/>
+          <w:color w:val="7A1F3D"/>
           <w:sz w:val="21"/>
         </w:rPr>
         <w:t>Matteo:</w:t>
@@ -9719,7 +9719,7 @@
         <w:rPr>
           <w:rFonts w:ascii="Calibri" w:hAnsi="Calibri" w:eastAsia="Malgun Gothic"/>
           <w:b/>
-          <w:color w:val="553C7A"/>
+          <w:color w:val="0F6E6E"/>
           <w:sz w:val="21"/>
         </w:rPr>
         <w:t>Renzo:</w:t>
@@ -9774,7 +9774,7 @@
           <w:color w:val="7A1F3D"/>
           <w:sz w:val="21"/>
         </w:rPr>
-        <w:t>Chiara:</w:t>
+        <w:t>Matteo:</w:t>
       </w:r>
       <w:r>
         <w:rPr>
@@ -9782,7 +9782,7 @@
           <w:sz w:val="21"/>
         </w:rPr>
         <w:tab/>
-        <w:t>두 가지 다 말씀하셨어, 필리포. 넌 네 편한 말만 듣고.</w:t>
+        <w:t>두 가지 다 말씀하셨어, 형. 형은 형 편한 말만 듣잖아.</w:t>
       </w:r>
     </w:p>
     <w:p>
@@ -9904,7 +9904,7 @@
           <w:color w:val="7A1F3D"/>
           <w:sz w:val="21"/>
         </w:rPr>
-        <w:t>Chiara:</w:t>
+        <w:t>Matteo:</w:t>
       </w:r>
       <w:r>
         <w:rPr>
@@ -10072,7 +10072,7 @@
         <w:rPr>
           <w:rFonts w:ascii="Calibri" w:hAnsi="Calibri" w:eastAsia="Malgun Gothic"/>
           <w:b/>
-          <w:color w:val="553C7A"/>
+          <w:color w:val="0F6E6E"/>
           <w:sz w:val="21"/>
         </w:rPr>
         <w:t>Renzo:</w:t>
@@ -10098,7 +10098,7 @@
         <w:rPr>
           <w:rFonts w:ascii="Calibri" w:hAnsi="Calibri" w:eastAsia="Malgun Gothic"/>
           <w:b/>
-          <w:color w:val="0F6E6E"/>
+          <w:color w:val="7A1F3D"/>
           <w:sz w:val="21"/>
         </w:rPr>
         <w:t>Matteo:</w:t>
@@ -10150,7 +10150,7 @@
         <w:rPr>
           <w:rFonts w:ascii="Calibri" w:hAnsi="Calibri" w:eastAsia="Malgun Gothic"/>
           <w:b/>
-          <w:color w:val="7A1F3D"/>
+          <w:color w:val="553C7A"/>
           <w:sz w:val="21"/>
         </w:rPr>
         <w:t>Chiara:</w:t>
@@ -10202,7 +10202,7 @@
         <w:rPr>
           <w:rFonts w:ascii="Calibri" w:hAnsi="Calibri" w:eastAsia="Malgun Gothic"/>
           <w:b/>
-          <w:color w:val="7A1F3D"/>
+          <w:color w:val="553C7A"/>
           <w:sz w:val="21"/>
         </w:rPr>
         <w:t>Chiara:</w:t>
@@ -10228,7 +10228,7 @@
         <w:rPr>
           <w:rFonts w:ascii="Calibri" w:hAnsi="Calibri" w:eastAsia="Malgun Gothic"/>
           <w:b/>
-          <w:color w:val="0F6E6E"/>
+          <w:color w:val="7A1F3D"/>
           <w:sz w:val="21"/>
         </w:rPr>
         <w:t>Matteo:</w:t>
@@ -10280,7 +10280,7 @@
         <w:rPr>
           <w:rFonts w:ascii="Calibri" w:hAnsi="Calibri" w:eastAsia="Malgun Gothic"/>
           <w:b/>
-          <w:color w:val="0F6E6E"/>
+          <w:color w:val="7A1F3D"/>
           <w:sz w:val="21"/>
         </w:rPr>
         <w:t>Matteo:</w:t>
@@ -10332,7 +10332,7 @@
         <w:rPr>
           <w:rFonts w:ascii="Calibri" w:hAnsi="Calibri" w:eastAsia="Malgun Gothic"/>
           <w:b/>
-          <w:color w:val="0F6E6E"/>
+          <w:color w:val="7A1F3D"/>
           <w:sz w:val="21"/>
         </w:rPr>
         <w:t>Matteo:</w:t>
@@ -10425,7 +10425,7 @@
         <w:rPr>
           <w:rFonts w:ascii="Calibri" w:hAnsi="Calibri" w:eastAsia="Malgun Gothic"/>
           <w:b/>
-          <w:color w:val="7A1F3D"/>
+          <w:color w:val="553C7A"/>
           <w:sz w:val="21"/>
         </w:rPr>
         <w:t>Chiara:</w:t>
@@ -10477,7 +10477,7 @@
         <w:rPr>
           <w:rFonts w:ascii="Calibri" w:hAnsi="Calibri" w:eastAsia="Malgun Gothic"/>
           <w:b/>
-          <w:color w:val="0F6E6E"/>
+          <w:color w:val="7A1F3D"/>
           <w:sz w:val="21"/>
         </w:rPr>
         <w:t>Matteo:</w:t>
@@ -10529,10 +10529,10 @@
         <w:rPr>
           <w:rFonts w:ascii="Calibri" w:hAnsi="Calibri" w:eastAsia="Malgun Gothic"/>
           <w:b/>
-          <w:color w:val="1F5A8C"/>
-          <w:sz w:val="21"/>
-        </w:rPr>
-        <w:t>Filippo:</w:t>
+          <w:color w:val="7A1F3D"/>
+          <w:sz w:val="21"/>
+        </w:rPr>
+        <w:t>Matteo:</w:t>
       </w:r>
       <w:r>
         <w:rPr>
@@ -10633,7 +10633,7 @@
         <w:rPr>
           <w:rFonts w:ascii="Calibri" w:hAnsi="Calibri" w:eastAsia="Malgun Gothic"/>
           <w:b/>
-          <w:color w:val="7A1F3D"/>
+          <w:color w:val="553C7A"/>
           <w:sz w:val="21"/>
         </w:rPr>
         <w:t>Chiara:</w:t>
@@ -10685,7 +10685,7 @@
         <w:rPr>
           <w:rFonts w:ascii="Calibri" w:hAnsi="Calibri" w:eastAsia="Malgun Gothic"/>
           <w:b/>
-          <w:color w:val="0F6E6E"/>
+          <w:color w:val="7A1F3D"/>
           <w:sz w:val="21"/>
         </w:rPr>
         <w:t>Matteo:</w:t>
@@ -10789,7 +10789,7 @@
         <w:rPr>
           <w:rFonts w:ascii="Calibri" w:hAnsi="Calibri" w:eastAsia="Malgun Gothic"/>
           <w:b/>
-          <w:color w:val="553C7A"/>
+          <w:color w:val="0F6E6E"/>
           <w:sz w:val="21"/>
         </w:rPr>
         <w:t>Renzo:</w:t>
@@ -10815,7 +10815,7 @@
         <w:rPr>
           <w:rFonts w:ascii="Calibri" w:hAnsi="Calibri" w:eastAsia="Malgun Gothic"/>
           <w:b/>
-          <w:color w:val="0F6E6E"/>
+          <w:color w:val="7A1F3D"/>
           <w:sz w:val="21"/>
         </w:rPr>
         <w:t>Matteo:</w:t>
@@ -10867,7 +10867,7 @@
         <w:rPr>
           <w:rFonts w:ascii="Calibri" w:hAnsi="Calibri" w:eastAsia="Malgun Gothic"/>
           <w:b/>
-          <w:color w:val="7A1F3D"/>
+          <w:color w:val="553C7A"/>
           <w:sz w:val="21"/>
         </w:rPr>
         <w:t>Chiara:</w:t>
@@ -10987,7 +10987,7 @@
           <w:color w:val="666666"/>
           <w:sz w:val="19"/>
         </w:rPr>
-        <w:t>재단대 위의 형광등, 가죽과 접착제 냄새. 키아라가 나란히 놓인 시제품 열두 개 앞에 혼자 서 있다. 문이 열린다. 열쇠 꾸러미를 든 렌초다.</w:t>
+        <w:t>재단대 위의 형광등, 가죽과 접착제 냄새. 마테오가 나란히 놓인 키아라의 시제품 열두 개 앞에 혼자 서 있다. 하나씩 휴대폰으로 사진을 찍는다. 문이 열린다. 열쇠 꾸러미를 든 렌초다.</w:t>
       </w:r>
     </w:p>
     <w:p>
@@ -11002,7 +11002,7 @@
         <w:rPr>
           <w:rFonts w:ascii="Calibri" w:hAnsi="Calibri" w:eastAsia="Malgun Gothic"/>
           <w:b/>
-          <w:color w:val="553C7A"/>
+          <w:color w:val="0F6E6E"/>
           <w:sz w:val="21"/>
         </w:rPr>
         <w:t>Renzo:</w:t>
@@ -11013,7 +11013,7 @@
           <w:sz w:val="21"/>
         </w:rPr>
         <w:tab/>
-        <w:t>여기 있을 줄 알았다.</w:t>
+        <w:t>공방에서 45년인데, 아직도 일요일 밤이면 불이 꺼졌나 확인하러 와. 그런데 이번엔 켜져 있구먼.</w:t>
       </w:r>
     </w:p>
     <w:p>
@@ -11031,7 +11031,7 @@
           <w:color w:val="7A1F3D"/>
           <w:sz w:val="21"/>
         </w:rPr>
-        <w:t>Chiara:</w:t>
+        <w:t>Matteo:</w:t>
       </w:r>
       <w:r>
         <w:rPr>
@@ -11039,7 +11039,7 @@
           <w:sz w:val="21"/>
         </w:rPr>
         <w:tab/>
-        <w:t>렌초... 집에 있을 수가 없었어요.</w:t>
+        <w:t>렌초! 죄송합니다... 미안, 들어오는 소리를 못 들었어요. 서울에 보내려고 키아라 누나 컬렉션을 찍고 있었어요.</w:t>
       </w:r>
     </w:p>
     <w:p>
@@ -11054,7 +11054,7 @@
         <w:rPr>
           <w:rFonts w:ascii="Calibri" w:hAnsi="Calibri" w:eastAsia="Malgun Gothic"/>
           <w:b/>
-          <w:color w:val="553C7A"/>
+          <w:color w:val="0F6E6E"/>
           <w:sz w:val="21"/>
         </w:rPr>
         <w:t>Renzo:</w:t>
@@ -11065,7 +11065,7 @@
           <w:sz w:val="21"/>
         </w:rPr>
         <w:tab/>
-        <w:t>나도 그래. 공방에서 45년인데, 아직도 일요일 밤이면 불이 꺼졌나 확인하러 와.</w:t>
+        <w:t>누나한테 묻지도 않고?</w:t>
       </w:r>
     </w:p>
     <w:p>
@@ -11083,7 +11083,7 @@
           <w:color w:val="7A1F3D"/>
           <w:sz w:val="21"/>
         </w:rPr>
-        <w:t>Chiara:</w:t>
+        <w:t>Matteo:</w:t>
       </w:r>
       <w:r>
         <w:rPr>
@@ -11091,7 +11091,7 @@
           <w:sz w:val="21"/>
         </w:rPr>
         <w:tab/>
-        <w:t>보세요... 봐요. 이게 그 컬렉션이에요. 열두 가지 모델. 솔직히 어때요?</w:t>
+        <w:t>식탁에서 물어봤어요. 안 된다고는 안 했어요.</w:t>
       </w:r>
     </w:p>
     <w:p>
@@ -11106,7 +11106,7 @@
         <w:rPr>
           <w:rFonts w:ascii="Calibri" w:hAnsi="Calibri" w:eastAsia="Malgun Gothic"/>
           <w:b/>
-          <w:color w:val="553C7A"/>
+          <w:color w:val="0F6E6E"/>
           <w:sz w:val="21"/>
         </w:rPr>
         <w:t>Renzo:</w:t>
@@ -11117,7 +11117,7 @@
           <w:sz w:val="21"/>
         </w:rPr>
         <w:tab/>
-        <w:t>(가방 하나를 들어 돌려 보고, 엄지로 바느질선을 쓸어 보며) 가장자리 마감이 잘 칠해졌어. 땀도 고르고. 이건 네 할아버지가 만들었다 해도 믿겠다.</w:t>
+        <w:t>그렇다고도 안 했지. (가방 하나를 들어 돌려 보고, 엄지로 바느질선을 쓸어 보며) 그래도 하나는 확실해. 가장자리 마감이 잘 칠해졌고 땀도 고르다. 이건 네 할아버지가 만들었다 해도 믿겠다.</w:t>
       </w:r>
     </w:p>
     <w:p>
@@ -11135,7 +11135,7 @@
           <w:color w:val="7A1F3D"/>
           <w:sz w:val="21"/>
         </w:rPr>
-        <w:t>Chiara:</w:t>
+        <w:t>Matteo:</w:t>
       </w:r>
       <w:r>
         <w:rPr>
@@ -11143,7 +11143,7 @@
           <w:sz w:val="21"/>
         </w:rPr>
         <w:tab/>
-        <w:t>제가 들을 수 있는 가장 멋진 칭찬이에요.</w:t>
+        <w:t>키아라 누나한테는 렌초가 해 줄 수 있는 가장 멋진 칭찬이에요. 그럼 서울에서 팔 수 있겠네요?</w:t>
       </w:r>
     </w:p>
     <w:p>
@@ -11158,7 +11158,7 @@
         <w:rPr>
           <w:rFonts w:ascii="Calibri" w:hAnsi="Calibri" w:eastAsia="Malgun Gothic"/>
           <w:b/>
-          <w:color w:val="553C7A"/>
+          <w:color w:val="0F6E6E"/>
           <w:sz w:val="21"/>
         </w:rPr>
         <w:t>Renzo:</w:t>
@@ -11169,7 +11169,7 @@
           <w:sz w:val="21"/>
         </w:rPr>
         <w:tab/>
-        <w:t>칭찬이 아니라 기술적 판단이야. 그런데 하나가 빠졌어.</w:t>
+        <w:t>어디서든 팔 수 있지. 그런데 하나가 빠졌어.</w:t>
       </w:r>
     </w:p>
     <w:p>
@@ -11187,7 +11187,7 @@
           <w:color w:val="7A1F3D"/>
           <w:sz w:val="21"/>
         </w:rPr>
-        <w:t>Chiara:</w:t>
+        <w:t>Matteo:</w:t>
       </w:r>
       <w:r>
         <w:rPr>
@@ -11195,7 +11195,7 @@
           <w:sz w:val="21"/>
         </w:rPr>
         <w:tab/>
-        <w:t>뭐가요?</w:t>
+        <w:t>뭐요? 가격? 브랜드?</w:t>
       </w:r>
     </w:p>
     <w:p>
@@ -11210,7 +11210,7 @@
         <w:rPr>
           <w:rFonts w:ascii="Calibri" w:hAnsi="Calibri" w:eastAsia="Malgun Gothic"/>
           <w:b/>
-          <w:color w:val="553C7A"/>
+          <w:color w:val="0F6E6E"/>
           <w:sz w:val="21"/>
         </w:rPr>
         <w:t>Renzo:</w:t>
@@ -11221,7 +11221,7 @@
           <w:sz w:val="21"/>
         </w:rPr>
         <w:tab/>
-        <w:t>네 오빠와 동생의 배짱. 필리포는 회사를 버텨 내는 배짱이 있고, 마테오는 떠나는 배짱이 있지.</w:t>
+        <w:t>네 형과 누나의 배짱. 필리포는 회사를 버텨 내는 배짱이 있고, 키아라는 손이 있지.</w:t>
       </w:r>
     </w:p>
     <w:p>
@@ -11239,7 +11239,7 @@
           <w:color w:val="7A1F3D"/>
           <w:sz w:val="21"/>
         </w:rPr>
-        <w:t>Chiara:</w:t>
+        <w:t>Matteo:</w:t>
       </w:r>
       <w:r>
         <w:rPr>
@@ -11262,7 +11262,7 @@
         <w:rPr>
           <w:rFonts w:ascii="Calibri" w:hAnsi="Calibri" w:eastAsia="Malgun Gothic"/>
           <w:b/>
-          <w:color w:val="553C7A"/>
+          <w:color w:val="0F6E6E"/>
           <w:sz w:val="21"/>
         </w:rPr>
         <w:t>Renzo:</w:t>
@@ -11273,22 +11273,7 @@
           <w:sz w:val="21"/>
         </w:rPr>
         <w:tab/>
-        <w:t>넌 손이 있지. 하지만 손만으로는 팔 수 없어.</w:t>
-      </w:r>
-    </w:p>
-    <w:p>
-      <w:pPr>
-        <w:spacing w:after="120" w:before="80" w:line="288" w:lineRule="auto"/>
-      </w:pPr>
-      <w:r>
-        <w:rPr>
-          <w:rFonts w:ascii="Calibri" w:hAnsi="Calibri" w:eastAsia="Malgun Gothic"/>
-          <w:b w:val="0"/>
-          <w:i/>
-          <w:color w:val="666666"/>
-          <w:sz w:val="19"/>
-        </w:rPr>
-        <w:t>문이 다시 열린다. 마테오가 노트북을 옆구리에 끼고 들어온다.</w:t>
+        <w:t>넌 늘 여행 가방이 싸여 있지, 마테오. 하지만 가방 하나로는 못 팔아. 손만으로도 마찬가지고.</w:t>
       </w:r>
     </w:p>
     <w:p>
@@ -11303,7 +11288,7 @@
         <w:rPr>
           <w:rFonts w:ascii="Calibri" w:hAnsi="Calibri" w:eastAsia="Malgun Gothic"/>
           <w:b/>
-          <w:color w:val="0F6E6E"/>
+          <w:color w:val="7A1F3D"/>
           <w:sz w:val="21"/>
         </w:rPr>
         <w:t>Matteo:</w:t>
@@ -11314,7 +11299,22 @@
           <w:sz w:val="21"/>
         </w:rPr>
         <w:tab/>
-        <w:t>아, 두 사람도 여기 있었네. 그럼 이 집에서 미친 사람이 나만은 아니구나.</w:t>
+        <w:t>그러니까 셋이 함께여야 한다는 거네요. 엄마 말처럼.</w:t>
+      </w:r>
+    </w:p>
+    <w:p>
+      <w:pPr>
+        <w:spacing w:after="120" w:before="80" w:line="288" w:lineRule="auto"/>
+      </w:pPr>
+      <w:r>
+        <w:rPr>
+          <w:rFonts w:ascii="Calibri" w:hAnsi="Calibri" w:eastAsia="Malgun Gothic"/>
+          <w:b w:val="0"/>
+          <w:i/>
+          <w:color w:val="666666"/>
+          <w:sz w:val="19"/>
+        </w:rPr>
+        <w:t>문이 다시 열린다. 코트도 벗지 않은 키아라가 들어와, 마테오의 휴대폰 불빛 아래 놓인 자기 가방들을 본다.</w:t>
       </w:r>
     </w:p>
     <w:p>
@@ -11329,7 +11329,7 @@
         <w:rPr>
           <w:rFonts w:ascii="Calibri" w:hAnsi="Calibri" w:eastAsia="Malgun Gothic"/>
           <w:b/>
-          <w:color w:val="7A1F3D"/>
+          <w:color w:val="553C7A"/>
           <w:sz w:val="21"/>
         </w:rPr>
         <w:t>Chiara:</w:t>
@@ -11340,7 +11340,7 @@
           <w:sz w:val="21"/>
         </w:rPr>
         <w:tab/>
-        <w:t>여긴 왜 왔어?</w:t>
+        <w:t>내 가방들 가지고 여기서 뭐 해?</w:t>
       </w:r>
     </w:p>
     <w:p>
@@ -11355,7 +11355,7 @@
         <w:rPr>
           <w:rFonts w:ascii="Calibri" w:hAnsi="Calibri" w:eastAsia="Malgun Gothic"/>
           <w:b/>
-          <w:color w:val="0F6E6E"/>
+          <w:color w:val="7A1F3D"/>
           <w:sz w:val="21"/>
         </w:rPr>
         <w:t>Matteo:</w:t>
@@ -11381,7 +11381,7 @@
         <w:rPr>
           <w:rFonts w:ascii="Calibri" w:hAnsi="Calibri" w:eastAsia="Malgun Gothic"/>
           <w:b/>
-          <w:color w:val="7A1F3D"/>
+          <w:color w:val="553C7A"/>
           <w:sz w:val="21"/>
         </w:rPr>
         <w:t>Chiara:</w:t>
@@ -11407,7 +11407,7 @@
         <w:rPr>
           <w:rFonts w:ascii="Calibri" w:hAnsi="Calibri" w:eastAsia="Malgun Gothic"/>
           <w:b/>
-          <w:color w:val="0F6E6E"/>
+          <w:color w:val="7A1F3D"/>
           <w:sz w:val="21"/>
         </w:rPr>
         <w:t>Matteo:</w:t>
@@ -11433,7 +11433,7 @@
         <w:rPr>
           <w:rFonts w:ascii="Calibri" w:hAnsi="Calibri" w:eastAsia="Malgun Gothic"/>
           <w:b/>
-          <w:color w:val="7A1F3D"/>
+          <w:color w:val="553C7A"/>
           <w:sz w:val="21"/>
         </w:rPr>
         <w:t>Chiara:</w:t>
@@ -11459,7 +11459,7 @@
         <w:rPr>
           <w:rFonts w:ascii="Calibri" w:hAnsi="Calibri" w:eastAsia="Malgun Gothic"/>
           <w:b/>
-          <w:color w:val="0F6E6E"/>
+          <w:color w:val="7A1F3D"/>
           <w:sz w:val="21"/>
         </w:rPr>
         <w:t>Matteo:</w:t>
@@ -11470,7 +11470,7 @@
           <w:sz w:val="21"/>
         </w:rPr>
         <w:tab/>
-        <w:t>있어. 저기, 누나 테이블 위에. 가격만 빠졌을 뿐이야.</w:t>
+        <w:t>있어. 여기, 누나 테이블 위에. 가격만 빠졌을 뿐이야.</w:t>
       </w:r>
     </w:p>
     <w:p>
@@ -11485,7 +11485,7 @@
         <w:rPr>
           <w:rFonts w:ascii="Calibri" w:hAnsi="Calibri" w:eastAsia="Malgun Gothic"/>
           <w:b/>
-          <w:color w:val="553C7A"/>
+          <w:color w:val="0F6E6E"/>
           <w:sz w:val="21"/>
         </w:rPr>
         <w:t>Renzo:</w:t>
@@ -11511,7 +11511,7 @@
           <w:color w:val="666666"/>
           <w:sz w:val="19"/>
         </w:rPr>
-        <w:t>아무도 웃지 않는다. 마테오는 '보내기' 버튼 위에 손가락을 올려 둔 채다. 키아라는 열두 개의 가방을, 그다음 휴대폰을 바라보다가 큰오빠의 번호를 누른다.</w:t>
+        <w:t>아무도 웃지 않는다. 마테오는 '보내기' 버튼 위에 손가락을 올려 둔 채, 열두 개의 가방을, 그다음 누나를 바라본다. 키아라가 아주 살짝 고개를 끄덕인다. 마테오는 버튼에서 손가락을 떼고, 휴대폰을 들어 형의 번호를 누른다.</w:t>
       </w:r>
     </w:p>
     <w:p>

</xml_diff>